<commit_message>
S3 template debugged and validated within AWS CloudFormtion
</commit_message>
<xml_diff>
--- a/CYB260L/ec2-working.yaml.docx
+++ b/CYB260L/ec2-working.yaml.docx
@@ -13,7 +13,43 @@
         <w:rPr>
           <w:rFonts w:ascii="Courier New" w:hAnsi="Courier New" w:cs="Courier New"/>
         </w:rPr>
-        <w:t>AWSTemplateFormatVersion: "2010-09-09"</w:t>
+        <w:t># Description of what this change includes</w:t>
+      </w:r>
+      <w:r>
+        <w:rPr>
+          <w:rFonts w:ascii="Courier New" w:hAnsi="Courier New" w:cs="Courier New"/>
+        </w:rPr>
+        <w:br/>
+        <w:t># Revision number</w:t>
+      </w:r>
+      <w:r>
+        <w:rPr>
+          <w:rFonts w:ascii="Courier New" w:hAnsi="Courier New" w:cs="Courier New"/>
+        </w:rPr>
+        <w:br/>
+        <w:t># Date</w:t>
+      </w:r>
+    </w:p>
+    <w:p>
+      <w:pPr>
+        <w:pStyle w:val="PlainText"/>
+        <w:rPr>
+          <w:rFonts w:ascii="Courier New" w:hAnsi="Courier New" w:cs="Courier New"/>
+        </w:rPr>
+      </w:pPr>
+      <w:proofErr w:type="spellStart"/>
+      <w:r>
+        <w:rPr>
+          <w:rFonts w:ascii="Courier New" w:hAnsi="Courier New" w:cs="Courier New"/>
+        </w:rPr>
+        <w:t>AWSTemplateFormatVersion</w:t>
+      </w:r>
+      <w:proofErr w:type="spellEnd"/>
+      <w:r>
+        <w:rPr>
+          <w:rFonts w:ascii="Courier New" w:hAnsi="Courier New" w:cs="Courier New"/>
+        </w:rPr>
+        <w:t>: "2010-09-09"</w:t>
       </w:r>
     </w:p>
     <w:p>
@@ -55,7 +91,21 @@
         <w:rPr>
           <w:rFonts w:ascii="Courier New" w:hAnsi="Courier New" w:cs="Courier New"/>
         </w:rPr>
-        <w:t xml:space="preserve">  LatestAmiId:</w:t>
+        <w:t xml:space="preserve">  </w:t>
+      </w:r>
+      <w:proofErr w:type="spellStart"/>
+      <w:r>
+        <w:rPr>
+          <w:rFonts w:ascii="Courier New" w:hAnsi="Courier New" w:cs="Courier New"/>
+        </w:rPr>
+        <w:t>LatestAmiId</w:t>
+      </w:r>
+      <w:proofErr w:type="spellEnd"/>
+      <w:r>
+        <w:rPr>
+          <w:rFonts w:ascii="Courier New" w:hAnsi="Courier New" w:cs="Courier New"/>
+        </w:rPr>
+        <w:t>:</w:t>
       </w:r>
     </w:p>
     <w:p>
@@ -83,7 +133,49 @@
         <w:rPr>
           <w:rFonts w:ascii="Courier New" w:hAnsi="Courier New" w:cs="Courier New"/>
         </w:rPr>
-        <w:t xml:space="preserve">    Default: "/aws/service/ami-amazon-linux-latest/amzn2-ami-hvm-x86_64-gp2"</w:t>
+        <w:t xml:space="preserve">    Default: "/</w:t>
+      </w:r>
+      <w:proofErr w:type="spellStart"/>
+      <w:r>
+        <w:rPr>
+          <w:rFonts w:ascii="Courier New" w:hAnsi="Courier New" w:cs="Courier New"/>
+        </w:rPr>
+        <w:t>aws</w:t>
+      </w:r>
+      <w:proofErr w:type="spellEnd"/>
+      <w:r>
+        <w:rPr>
+          <w:rFonts w:ascii="Courier New" w:hAnsi="Courier New" w:cs="Courier New"/>
+        </w:rPr>
+        <w:t>/service/</w:t>
+      </w:r>
+      <w:proofErr w:type="spellStart"/>
+      <w:r>
+        <w:rPr>
+          <w:rFonts w:ascii="Courier New" w:hAnsi="Courier New" w:cs="Courier New"/>
+        </w:rPr>
+        <w:t>ami</w:t>
+      </w:r>
+      <w:proofErr w:type="spellEnd"/>
+      <w:r>
+        <w:rPr>
+          <w:rFonts w:ascii="Courier New" w:hAnsi="Courier New" w:cs="Courier New"/>
+        </w:rPr>
+        <w:t>-amazon-</w:t>
+      </w:r>
+      <w:proofErr w:type="spellStart"/>
+      <w:r>
+        <w:rPr>
+          <w:rFonts w:ascii="Courier New" w:hAnsi="Courier New" w:cs="Courier New"/>
+        </w:rPr>
+        <w:t>linux</w:t>
+      </w:r>
+      <w:proofErr w:type="spellEnd"/>
+      <w:r>
+        <w:rPr>
+          <w:rFonts w:ascii="Courier New" w:hAnsi="Courier New" w:cs="Courier New"/>
+        </w:rPr>
+        <w:t>-latest/amzn2-ami-hvm-x86_64-gp2"</w:t>
       </w:r>
     </w:p>
     <w:p>
@@ -153,77 +245,312 @@
         <w:rPr>
           <w:rFonts w:ascii="Courier New" w:hAnsi="Courier New" w:cs="Courier New"/>
         </w:rPr>
-        <w:t xml:space="preserve">      ImageId: !Ref LatestAmiId</w:t>
-      </w:r>
-    </w:p>
-    <w:p>
-      <w:pPr>
-        <w:pStyle w:val="PlainText"/>
-        <w:rPr>
-          <w:rFonts w:ascii="Courier New" w:hAnsi="Courier New" w:cs="Courier New"/>
-        </w:rPr>
-      </w:pPr>
-      <w:r>
-        <w:rPr>
-          <w:rFonts w:ascii="Courier New" w:hAnsi="Courier New" w:cs="Courier New"/>
-        </w:rPr>
-        <w:t xml:space="preserve">      KeyName: !Ref AWS::AccountId</w:t>
-      </w:r>
-    </w:p>
-    <w:p>
-      <w:pPr>
-        <w:pStyle w:val="PlainText"/>
-        <w:rPr>
-          <w:rFonts w:ascii="Courier New" w:hAnsi="Courier New" w:cs="Courier New"/>
-        </w:rPr>
-      </w:pPr>
-      <w:r>
-        <w:rPr>
-          <w:rFonts w:ascii="Courier New" w:hAnsi="Courier New" w:cs="Courier New"/>
-        </w:rPr>
-        <w:t xml:space="preserve">      InstanceType: t2.micro</w:t>
-      </w:r>
-    </w:p>
-    <w:p>
-      <w:pPr>
-        <w:pStyle w:val="PlainText"/>
-        <w:rPr>
-          <w:rFonts w:ascii="Courier New" w:hAnsi="Courier New" w:cs="Courier New"/>
-        </w:rPr>
-      </w:pPr>
-      <w:r>
-        <w:rPr>
-          <w:rFonts w:ascii="Courier New" w:hAnsi="Courier New" w:cs="Courier New"/>
-        </w:rPr>
-        <w:t xml:space="preserve">      NetworkInterfaces:</w:t>
-      </w:r>
-    </w:p>
-    <w:p>
-      <w:pPr>
-        <w:pStyle w:val="PlainText"/>
-        <w:rPr>
-          <w:rFonts w:ascii="Courier New" w:hAnsi="Courier New" w:cs="Courier New"/>
-        </w:rPr>
-      </w:pPr>
-      <w:r>
-        <w:rPr>
-          <w:rFonts w:ascii="Courier New" w:hAnsi="Courier New" w:cs="Courier New"/>
-        </w:rPr>
-        <w:t xml:space="preserve">        - AssociatePublicIpAddress: "true"</w:t>
-      </w:r>
-    </w:p>
-    <w:p>
-      <w:pPr>
-        <w:pStyle w:val="PlainText"/>
-        <w:rPr>
-          <w:rFonts w:ascii="Courier New" w:hAnsi="Courier New" w:cs="Courier New"/>
-        </w:rPr>
-      </w:pPr>
-      <w:r>
-        <w:rPr>
-          <w:rFonts w:ascii="Courier New" w:hAnsi="Courier New" w:cs="Courier New"/>
-        </w:rPr>
-        <w:t xml:space="preserve">          DeviceIndex: "0"</w:t>
+        <w:t xml:space="preserve">      </w:t>
+      </w:r>
+      <w:proofErr w:type="spellStart"/>
+      <w:r>
+        <w:rPr>
+          <w:rFonts w:ascii="Courier New" w:hAnsi="Courier New" w:cs="Courier New"/>
+        </w:rPr>
+        <w:t>ImageId</w:t>
+      </w:r>
+      <w:proofErr w:type="spellEnd"/>
+      <w:r>
+        <w:rPr>
+          <w:rFonts w:ascii="Courier New" w:hAnsi="Courier New" w:cs="Courier New"/>
+        </w:rPr>
+        <w:t xml:space="preserve">: !Ref </w:t>
+      </w:r>
+      <w:proofErr w:type="spellStart"/>
+      <w:r>
+        <w:rPr>
+          <w:rFonts w:ascii="Courier New" w:hAnsi="Courier New" w:cs="Courier New"/>
+        </w:rPr>
+        <w:t>LatestAmiId</w:t>
+      </w:r>
+      <w:proofErr w:type="spellEnd"/>
+    </w:p>
+    <w:p>
+      <w:pPr>
+        <w:pStyle w:val="PlainText"/>
+        <w:rPr>
+          <w:rFonts w:ascii="Courier New" w:hAnsi="Courier New" w:cs="Courier New"/>
+        </w:rPr>
+      </w:pPr>
+      <w:r>
+        <w:rPr>
+          <w:rFonts w:ascii="Courier New" w:hAnsi="Courier New" w:cs="Courier New"/>
+        </w:rPr>
+        <w:t xml:space="preserve">      </w:t>
+      </w:r>
+      <w:proofErr w:type="spellStart"/>
+      <w:r>
+        <w:rPr>
+          <w:rFonts w:ascii="Courier New" w:hAnsi="Courier New" w:cs="Courier New"/>
+        </w:rPr>
+        <w:t>KeyName</w:t>
+      </w:r>
+      <w:proofErr w:type="spellEnd"/>
+      <w:r>
+        <w:rPr>
+          <w:rFonts w:ascii="Courier New" w:hAnsi="Courier New" w:cs="Courier New"/>
+        </w:rPr>
+        <w:t>: !Ref AWS::</w:t>
+      </w:r>
+      <w:proofErr w:type="spellStart"/>
+      <w:r>
+        <w:rPr>
+          <w:rFonts w:ascii="Courier New" w:hAnsi="Courier New" w:cs="Courier New"/>
+        </w:rPr>
+        <w:t>AccountId</w:t>
+      </w:r>
+      <w:proofErr w:type="spellEnd"/>
+    </w:p>
+    <w:p>
+      <w:pPr>
+        <w:pStyle w:val="PlainText"/>
+        <w:rPr>
+          <w:rFonts w:ascii="Courier New" w:hAnsi="Courier New" w:cs="Courier New"/>
+        </w:rPr>
+      </w:pPr>
+      <w:r>
+        <w:rPr>
+          <w:rFonts w:ascii="Courier New" w:hAnsi="Courier New" w:cs="Courier New"/>
+        </w:rPr>
+        <w:t xml:space="preserve">      </w:t>
+      </w:r>
+      <w:proofErr w:type="spellStart"/>
+      <w:r>
+        <w:rPr>
+          <w:rFonts w:ascii="Courier New" w:hAnsi="Courier New" w:cs="Courier New"/>
+        </w:rPr>
+        <w:t>InstanceType</w:t>
+      </w:r>
+      <w:proofErr w:type="spellEnd"/>
+      <w:r>
+        <w:rPr>
+          <w:rFonts w:ascii="Courier New" w:hAnsi="Courier New" w:cs="Courier New"/>
+        </w:rPr>
+        <w:t>: t2.micro</w:t>
+      </w:r>
+    </w:p>
+    <w:p>
+      <w:pPr>
+        <w:pStyle w:val="PlainText"/>
+        <w:rPr>
+          <w:rFonts w:ascii="Courier New" w:hAnsi="Courier New" w:cs="Courier New"/>
+        </w:rPr>
+      </w:pPr>
+      <w:r>
+        <w:rPr>
+          <w:rFonts w:ascii="Courier New" w:hAnsi="Courier New" w:cs="Courier New"/>
+        </w:rPr>
+        <w:t xml:space="preserve">      </w:t>
+      </w:r>
+      <w:proofErr w:type="spellStart"/>
+      <w:r>
+        <w:rPr>
+          <w:rFonts w:ascii="Courier New" w:hAnsi="Courier New" w:cs="Courier New"/>
+        </w:rPr>
+        <w:t>NetworkInterfaces</w:t>
+      </w:r>
+      <w:proofErr w:type="spellEnd"/>
+      <w:r>
+        <w:rPr>
+          <w:rFonts w:ascii="Courier New" w:hAnsi="Courier New" w:cs="Courier New"/>
+        </w:rPr>
+        <w:t>:</w:t>
+      </w:r>
+    </w:p>
+    <w:p>
+      <w:pPr>
+        <w:pStyle w:val="PlainText"/>
+        <w:rPr>
+          <w:rFonts w:ascii="Courier New" w:hAnsi="Courier New" w:cs="Courier New"/>
+        </w:rPr>
+      </w:pPr>
+      <w:r>
+        <w:rPr>
+          <w:rFonts w:ascii="Courier New" w:hAnsi="Courier New" w:cs="Courier New"/>
+        </w:rPr>
+        <w:t xml:space="preserve">        - </w:t>
+      </w:r>
+      <w:proofErr w:type="spellStart"/>
+      <w:r>
+        <w:rPr>
+          <w:rFonts w:ascii="Courier New" w:hAnsi="Courier New" w:cs="Courier New"/>
+        </w:rPr>
+        <w:t>AssociatePublicIpAddress</w:t>
+      </w:r>
+      <w:proofErr w:type="spellEnd"/>
+      <w:r>
+        <w:rPr>
+          <w:rFonts w:ascii="Courier New" w:hAnsi="Courier New" w:cs="Courier New"/>
+        </w:rPr>
+        <w:t>: "true"</w:t>
+      </w:r>
+    </w:p>
+    <w:p>
+      <w:pPr>
+        <w:pStyle w:val="PlainText"/>
+        <w:rPr>
+          <w:rFonts w:ascii="Courier New" w:hAnsi="Courier New" w:cs="Courier New"/>
+        </w:rPr>
+      </w:pPr>
+      <w:r>
+        <w:rPr>
+          <w:rFonts w:ascii="Courier New" w:hAnsi="Courier New" w:cs="Courier New"/>
+        </w:rPr>
+        <w:t xml:space="preserve">          </w:t>
+      </w:r>
+      <w:proofErr w:type="spellStart"/>
+      <w:r>
+        <w:rPr>
+          <w:rFonts w:ascii="Courier New" w:hAnsi="Courier New" w:cs="Courier New"/>
+        </w:rPr>
+        <w:t>DeviceIndex</w:t>
+      </w:r>
+      <w:proofErr w:type="spellEnd"/>
+      <w:r>
+        <w:rPr>
+          <w:rFonts w:ascii="Courier New" w:hAnsi="Courier New" w:cs="Courier New"/>
+        </w:rPr>
+        <w:t>: "0"</w:t>
+      </w:r>
+    </w:p>
+    <w:p>
+      <w:pPr>
+        <w:pStyle w:val="PlainText"/>
+        <w:rPr>
+          <w:rFonts w:ascii="Courier New" w:hAnsi="Courier New" w:cs="Courier New"/>
+        </w:rPr>
+      </w:pPr>
+      <w:proofErr w:type="spellStart"/>
+      <w:r>
+        <w:rPr>
+          <w:rFonts w:ascii="Courier New" w:hAnsi="Courier New" w:cs="Courier New"/>
+        </w:rPr>
+        <w:t>BlockDeviceMappings</w:t>
+      </w:r>
+      <w:proofErr w:type="spellEnd"/>
+      <w:r>
+        <w:rPr>
+          <w:rFonts w:ascii="Courier New" w:hAnsi="Courier New" w:cs="Courier New"/>
+        </w:rPr>
+        <w:t>:</w:t>
+      </w:r>
+      <w:r>
+        <w:rPr>
+          <w:rFonts w:ascii="Courier New" w:hAnsi="Courier New" w:cs="Courier New"/>
+        </w:rPr>
+        <w:br/>
+        <w:t xml:space="preserve">     - </w:t>
+      </w:r>
+      <w:proofErr w:type="spellStart"/>
+      <w:r>
+        <w:rPr>
+          <w:rFonts w:ascii="Courier New" w:hAnsi="Courier New" w:cs="Courier New"/>
+        </w:rPr>
+        <w:t>DeviceName</w:t>
+      </w:r>
+      <w:proofErr w:type="spellEnd"/>
+      <w:r>
+        <w:rPr>
+          <w:rFonts w:ascii="Courier New" w:hAnsi="Courier New" w:cs="Courier New"/>
+        </w:rPr>
+        <w:t>: /dev/</w:t>
+      </w:r>
+      <w:proofErr w:type="spellStart"/>
+      <w:r>
+        <w:rPr>
+          <w:rFonts w:ascii="Courier New" w:hAnsi="Courier New" w:cs="Courier New"/>
+        </w:rPr>
+        <w:t>sdm</w:t>
+      </w:r>
+      <w:proofErr w:type="spellEnd"/>
+      <w:r>
+        <w:rPr>
+          <w:rFonts w:ascii="Courier New" w:hAnsi="Courier New" w:cs="Courier New"/>
+        </w:rPr>
+        <w:br/>
+        <w:t xml:space="preserve">        </w:t>
+      </w:r>
+      <w:proofErr w:type="spellStart"/>
+      <w:r>
+        <w:rPr>
+          <w:rFonts w:ascii="Courier New" w:hAnsi="Courier New" w:cs="Courier New"/>
+        </w:rPr>
+        <w:t>Ebs</w:t>
+      </w:r>
+      <w:proofErr w:type="spellEnd"/>
+      <w:r>
+        <w:rPr>
+          <w:rFonts w:ascii="Courier New" w:hAnsi="Courier New" w:cs="Courier New"/>
+        </w:rPr>
+        <w:t>:</w:t>
+      </w:r>
+      <w:r>
+        <w:rPr>
+          <w:rFonts w:ascii="Courier New" w:hAnsi="Courier New" w:cs="Courier New"/>
+        </w:rPr>
+        <w:br/>
+        <w:t xml:space="preserve">             </w:t>
+      </w:r>
+      <w:proofErr w:type="spellStart"/>
+      <w:r>
+        <w:rPr>
+          <w:rFonts w:ascii="Courier New" w:hAnsi="Courier New" w:cs="Courier New"/>
+        </w:rPr>
+        <w:t>VolumeType</w:t>
+      </w:r>
+      <w:proofErr w:type="spellEnd"/>
+      <w:r>
+        <w:rPr>
+          <w:rFonts w:ascii="Courier New" w:hAnsi="Courier New" w:cs="Courier New"/>
+        </w:rPr>
+        <w:t>: gp2</w:t>
+      </w:r>
+      <w:r>
+        <w:rPr>
+          <w:rFonts w:ascii="Courier New" w:hAnsi="Courier New" w:cs="Courier New"/>
+        </w:rPr>
+        <w:br/>
+        <w:t xml:space="preserve">             </w:t>
+      </w:r>
+      <w:proofErr w:type="spellStart"/>
+      <w:r>
+        <w:rPr>
+          <w:rFonts w:ascii="Courier New" w:hAnsi="Courier New" w:cs="Courier New"/>
+        </w:rPr>
+        <w:t>DeleteOnTermination</w:t>
+      </w:r>
+      <w:proofErr w:type="spellEnd"/>
+      <w:r>
+        <w:rPr>
+          <w:rFonts w:ascii="Courier New" w:hAnsi="Courier New" w:cs="Courier New"/>
+        </w:rPr>
+        <w:t>: false</w:t>
+      </w:r>
+      <w:r>
+        <w:rPr>
+          <w:rFonts w:ascii="Courier New" w:hAnsi="Courier New" w:cs="Courier New"/>
+        </w:rPr>
+        <w:br/>
+        <w:t xml:space="preserve">             </w:t>
+      </w:r>
+      <w:proofErr w:type="spellStart"/>
+      <w:r>
+        <w:rPr>
+          <w:rFonts w:ascii="Courier New" w:hAnsi="Courier New" w:cs="Courier New"/>
+        </w:rPr>
+        <w:t>VolumeSize</w:t>
+      </w:r>
+      <w:proofErr w:type="spellEnd"/>
+      <w:r>
+        <w:rPr>
+          <w:rFonts w:ascii="Courier New" w:hAnsi="Courier New" w:cs="Courier New"/>
+        </w:rPr>
+        <w:t>: 20</w:t>
       </w:r>
     </w:p>
     <w:sectPr>
@@ -640,7 +967,6 @@
   <w:style w:type="character" w:default="1" w:styleId="DefaultParagraphFont">
     <w:name w:val="Default Paragraph Font"/>
     <w:uiPriority w:val="1"/>
-    <w:semiHidden/>
     <w:unhideWhenUsed/>
   </w:style>
   <w:style w:type="table" w:default="1" w:styleId="TableNormal">

</xml_diff>